<commit_message>
Glossário: reconstrói o .docx (sem campo de sumário e sem entradas de diretório no zip) e adiciona versão em PDF
Co-Authored-By: Claude Sonnet 5.5 <noreply@anthropic.com>
Claude-Session: https://claude.ai/code/session_017j1yn8rinsfYMgMzrf5Azj
</commit_message>
<xml_diff>
--- a/docs/glossario-luhmann.docx
+++ b/docs/glossario-luhmann.docx
@@ -34,41 +34,6 @@
         <w:t xml:space="preserve">Luhmann e a recepção em Teubner, Neves e Leonel Severo Rocha</w:t>
       </w:r>
     </w:p>
-    <w:p>
-      <w:pPr>
-        <w:spacing w:after="240"/>
-        <w:jc w:val="center"/>
-      </w:pPr>
-      <w:r>
-        <w:rPr>
-          <w:rFonts w:ascii="Times New Roman" w:cs="Times New Roman" w:eastAsia="Times New Roman" w:hAnsi="Times New Roman"/>
-          <w:b/>
-          <w:bCs/>
-          <w:sz w:val="24"/>
-          <w:szCs w:val="24"/>
-        </w:rPr>
-        <w:t xml:space="preserve">SUMÁRIO</w:t>
-      </w:r>
-    </w:p>
-    <w:sdt>
-      <w:sdtPr>
-        <w:alias w:val="Sumário"/>
-      </w:sdtPr>
-      <w:sdtContent>
-        <w:p>
-          <w:r>
-            <w:fldChar w:fldCharType="begin" w:dirty="true"/>
-            <w:instrText xml:space="preserve">TOC \h \o "1-3"</w:instrText>
-            <w:fldChar w:fldCharType="separate"/>
-          </w:r>
-        </w:p>
-        <w:p>
-          <w:r>
-            <w:fldChar w:fldCharType="end"/>
-          </w:r>
-        </w:p>
-      </w:sdtContent>
-    </w:sdt>
     <w:p>
       <w:r>
         <w:br w:type="page"/>

</xml_diff>